<commit_message>
Add multi-business support with auto-seeding
</commit_message>
<xml_diff>
--- a/hotel-ai-conciergeDOC.docx
+++ b/hotel-ai-conciergeDOC.docx
@@ -449,31 +449,17 @@
         <w:t xml:space="preserve"> </w:t>
       </w:r>
       <w:proofErr w:type="spellStart"/>
-      <w:proofErr w:type="gramStart"/>
-      <w:r>
-        <w:rPr>
-          <w:rFonts w:ascii="Consolas" w:eastAsia="Times New Roman" w:hAnsi="Consolas" w:cs="Courier New"/>
-          <w:color w:val="0F1115"/>
-          <w:kern w:val="0"/>
-          <w:sz w:val="20"/>
-          <w:szCs w:val="20"/>
-          <w:lang w:eastAsia="en-GH"/>
-          <w14:ligatures w14:val="none"/>
-        </w:rPr>
-        <w:t>app.main</w:t>
-      </w:r>
-      <w:proofErr w:type="gramEnd"/>
-      <w:r>
-        <w:rPr>
-          <w:rFonts w:ascii="Consolas" w:eastAsia="Times New Roman" w:hAnsi="Consolas" w:cs="Courier New"/>
-          <w:color w:val="0F1115"/>
-          <w:kern w:val="0"/>
-          <w:sz w:val="20"/>
-          <w:szCs w:val="20"/>
-          <w:lang w:eastAsia="en-GH"/>
-          <w14:ligatures w14:val="none"/>
-        </w:rPr>
-        <w:t>:app</w:t>
+      <w:r>
+        <w:rPr>
+          <w:rFonts w:ascii="Consolas" w:eastAsia="Times New Roman" w:hAnsi="Consolas" w:cs="Courier New"/>
+          <w:color w:val="0F1115"/>
+          <w:kern w:val="0"/>
+          <w:sz w:val="20"/>
+          <w:szCs w:val="20"/>
+          <w:lang w:eastAsia="en-GH"/>
+          <w14:ligatures w14:val="none"/>
+        </w:rPr>
+        <w:t>app.main:app</w:t>
       </w:r>
       <w:proofErr w:type="spellEnd"/>
       <w:r>
@@ -622,161 +608,10 @@
         <w:t>\hotel-ai-concierge</w:t>
       </w:r>
     </w:p>
-    <w:p>
-      <w:pPr>
-        <w:shd w:val="clear" w:color="auto" w:fill="FFFFFF"/>
-        <w:tabs>
-          <w:tab w:val="left" w:pos="916"/>
-          <w:tab w:val="left" w:pos="1832"/>
-          <w:tab w:val="left" w:pos="2748"/>
-          <w:tab w:val="left" w:pos="3664"/>
-          <w:tab w:val="left" w:pos="4580"/>
-          <w:tab w:val="left" w:pos="5496"/>
-          <w:tab w:val="left" w:pos="6412"/>
-          <w:tab w:val="left" w:pos="7328"/>
-          <w:tab w:val="left" w:pos="8244"/>
-          <w:tab w:val="left" w:pos="9160"/>
-          <w:tab w:val="left" w:pos="10076"/>
-          <w:tab w:val="left" w:pos="10992"/>
-          <w:tab w:val="left" w:pos="11908"/>
-          <w:tab w:val="left" w:pos="12824"/>
-          <w:tab w:val="left" w:pos="13740"/>
-          <w:tab w:val="left" w:pos="14656"/>
-        </w:tabs>
-        <w:wordWrap w:val="0"/>
-        <w:spacing w:after="0" w:line="330" w:lineRule="atLeast"/>
-        <w:rPr>
-          <w:rFonts w:ascii="Consolas" w:eastAsia="Times New Roman" w:hAnsi="Consolas" w:cs="Courier New"/>
-          <w:color w:val="0F1115"/>
-          <w:kern w:val="0"/>
-          <w:sz w:val="20"/>
-          <w:szCs w:val="20"/>
-          <w:lang w:eastAsia="en-GH"/>
-          <w14:ligatures w14:val="none"/>
-        </w:rPr>
-      </w:pPr>
-      <w:proofErr w:type="spellStart"/>
-      <w:r>
-        <w:rPr>
-          <w:rFonts w:ascii="Consolas" w:eastAsia="Times New Roman" w:hAnsi="Consolas" w:cs="Courier New"/>
-          <w:color w:val="0F1115"/>
-          <w:kern w:val="0"/>
-          <w:sz w:val="20"/>
-          <w:szCs w:val="20"/>
-          <w:lang w:eastAsia="en-GH"/>
-          <w14:ligatures w14:val="none"/>
-        </w:rPr>
-        <w:t>venv</w:t>
-      </w:r>
-      <w:proofErr w:type="spellEnd"/>
-      <w:r>
-        <w:rPr>
-          <w:rFonts w:ascii="Consolas" w:eastAsia="Times New Roman" w:hAnsi="Consolas" w:cs="Courier New"/>
-          <w:color w:val="0F1115"/>
-          <w:kern w:val="0"/>
-          <w:sz w:val="20"/>
-          <w:szCs w:val="20"/>
-          <w:lang w:eastAsia="en-GH"/>
-          <w14:ligatures w14:val="none"/>
-        </w:rPr>
-        <w:t>\Scripts\activate</w:t>
-      </w:r>
-    </w:p>
-    <w:p>
-      <w:pPr>
-        <w:shd w:val="clear" w:color="auto" w:fill="FFFFFF"/>
-        <w:tabs>
-          <w:tab w:val="left" w:pos="916"/>
-          <w:tab w:val="left" w:pos="1832"/>
-          <w:tab w:val="left" w:pos="2748"/>
-          <w:tab w:val="left" w:pos="3664"/>
-          <w:tab w:val="left" w:pos="4580"/>
-          <w:tab w:val="left" w:pos="5496"/>
-          <w:tab w:val="left" w:pos="6412"/>
-          <w:tab w:val="left" w:pos="7328"/>
-          <w:tab w:val="left" w:pos="8244"/>
-          <w:tab w:val="left" w:pos="9160"/>
-          <w:tab w:val="left" w:pos="10076"/>
-          <w:tab w:val="left" w:pos="10992"/>
-          <w:tab w:val="left" w:pos="11908"/>
-          <w:tab w:val="left" w:pos="12824"/>
-          <w:tab w:val="left" w:pos="13740"/>
-          <w:tab w:val="left" w:pos="14656"/>
-        </w:tabs>
-        <w:wordWrap w:val="0"/>
-        <w:spacing w:after="0" w:line="330" w:lineRule="atLeast"/>
-        <w:rPr>
-          <w:rFonts w:ascii="Consolas" w:eastAsia="Times New Roman" w:hAnsi="Consolas" w:cs="Courier New"/>
-          <w:color w:val="0F1115"/>
-          <w:kern w:val="0"/>
-          <w:sz w:val="20"/>
-          <w:szCs w:val="20"/>
-          <w:lang w:eastAsia="en-GH"/>
-          <w14:ligatures w14:val="none"/>
-        </w:rPr>
-      </w:pPr>
-      <w:r>
-        <w:rPr>
-          <w:rFonts w:ascii="Consolas" w:eastAsia="Times New Roman" w:hAnsi="Consolas" w:cs="Courier New"/>
-          <w:color w:val="0F1115"/>
-          <w:kern w:val="0"/>
-          <w:sz w:val="20"/>
-          <w:szCs w:val="20"/>
-          <w:lang w:eastAsia="en-GH"/>
-          <w14:ligatures w14:val="none"/>
-        </w:rPr>
-        <w:t>python test_ai.py</w:t>
-      </w:r>
-    </w:p>
-    <w:p>
-      <w:pPr>
-        <w:shd w:val="clear" w:color="auto" w:fill="FFFFFF"/>
-        <w:spacing w:before="480" w:after="240" w:line="480" w:lineRule="atLeast"/>
-        <w:outlineLvl w:val="1"/>
-        <w:rPr>
-          <w:rFonts w:ascii="Segoe UI" w:eastAsia="Times New Roman" w:hAnsi="Segoe UI" w:cs="Segoe UI"/>
-          <w:b/>
-          <w:bCs/>
-          <w:color w:val="0F1115"/>
-          <w:kern w:val="0"/>
-          <w:sz w:val="33"/>
-          <w:szCs w:val="33"/>
-          <w:lang w:eastAsia="en-GH"/>
-          <w14:ligatures w14:val="none"/>
-        </w:rPr>
-      </w:pPr>
-      <w:r>
-        <w:rPr>
-          <w:rFonts w:ascii="Segoe UI Emoji" w:eastAsia="Times New Roman" w:hAnsi="Segoe UI Emoji" w:cs="Segoe UI Emoji"/>
-          <w:b/>
-          <w:bCs/>
-          <w:color w:val="0F1115"/>
-          <w:kern w:val="0"/>
-          <w:sz w:val="33"/>
-          <w:szCs w:val="33"/>
-          <w:lang w:eastAsia="en-GH"/>
-          <w14:ligatures w14:val="none"/>
-        </w:rPr>
-        <w:t>📋</w:t>
-      </w:r>
-      <w:r>
-        <w:rPr>
-          <w:rFonts w:ascii="Segoe UI" w:eastAsia="Times New Roman" w:hAnsi="Segoe UI" w:cs="Segoe UI"/>
-          <w:b/>
-          <w:bCs/>
-          <w:color w:val="0F1115"/>
-          <w:kern w:val="0"/>
-          <w:sz w:val="33"/>
-          <w:szCs w:val="33"/>
-          <w:lang w:eastAsia="en-GH"/>
-          <w14:ligatures w14:val="none"/>
-        </w:rPr>
-        <w:t xml:space="preserve"> Commands Summary</w:t>
-      </w:r>
-    </w:p>
     <w:tbl>
       <w:tblPr>
-        <w:tblW w:w="11280" w:type="dxa"/>
+        <w:tblpPr w:leftFromText="180" w:rightFromText="180" w:vertAnchor="page" w:horzAnchor="page" w:tblpX="1" w:tblpY="8673"/>
+        <w:tblW w:w="13161" w:type="dxa"/>
         <w:tblCellMar>
           <w:top w:w="15" w:type="dxa"/>
           <w:left w:w="15" w:type="dxa"/>
@@ -786,8 +621,8 @@
         <w:tblLook w:val="04A0" w:firstRow="1" w:lastRow="0" w:firstColumn="1" w:lastColumn="0" w:noHBand="0" w:noVBand="1"/>
       </w:tblPr>
       <w:tblGrid>
-        <w:gridCol w:w="1834"/>
-        <w:gridCol w:w="9446"/>
+        <w:gridCol w:w="7203"/>
+        <w:gridCol w:w="5958"/>
       </w:tblGrid>
       <w:tr>
         <w:trPr>
@@ -1054,7 +889,6 @@
               <w:t xml:space="preserve"> </w:t>
             </w:r>
             <w:proofErr w:type="spellStart"/>
-            <w:proofErr w:type="gramStart"/>
             <w:r>
               <w:rPr>
                 <w:rFonts w:ascii="Consolas" w:eastAsia="Times New Roman" w:hAnsi="Consolas" w:cs="Courier New"/>
@@ -1065,20 +899,7 @@
                 <w:lang w:eastAsia="en-GH"/>
                 <w14:ligatures w14:val="none"/>
               </w:rPr>
-              <w:t>app.main</w:t>
-            </w:r>
-            <w:proofErr w:type="gramEnd"/>
-            <w:r>
-              <w:rPr>
-                <w:rFonts w:ascii="Consolas" w:eastAsia="Times New Roman" w:hAnsi="Consolas" w:cs="Courier New"/>
-                <w:kern w:val="0"/>
-                <w:sz w:val="20"/>
-                <w:szCs w:val="20"/>
-                <w:shd w:val="clear" w:color="auto" w:fill="EBEEF2"/>
-                <w:lang w:eastAsia="en-GH"/>
-                <w14:ligatures w14:val="none"/>
-              </w:rPr>
-              <w:t>:app</w:t>
+              <w:t>app.main:app</w:t>
             </w:r>
             <w:proofErr w:type="spellEnd"/>
             <w:r>
@@ -1271,10 +1092,163 @@
                 <w:lang w:eastAsia="en-GH"/>
                 <w14:ligatures w14:val="none"/>
               </w:rPr>
-              <w:t>" -d "{\"message\</w:t>
-            </w:r>
-            <w:proofErr w:type="gramStart"/>
-            <w:r>
+              <w:t>" -d "{\"message\":{\"text\":\"test\"},\"from\":\"233\"}"</w:t>
+            </w:r>
+          </w:p>
+        </w:tc>
+      </w:tr>
+      <w:tr>
+        <w:tc>
+          <w:tcPr>
+            <w:tcW w:w="0" w:type="auto"/>
+            <w:tcMar>
+              <w:top w:w="150" w:type="dxa"/>
+              <w:left w:w="0" w:type="dxa"/>
+              <w:bottom w:w="150" w:type="dxa"/>
+              <w:right w:w="240" w:type="dxa"/>
+            </w:tcMar>
+            <w:vAlign w:val="center"/>
+          </w:tcPr>
+          <w:p>
+            <w:pPr>
+              <w:spacing w:after="0" w:line="375" w:lineRule="atLeast"/>
+              <w:rPr>
+                <w:rFonts w:ascii="Segoe UI" w:eastAsia="Times New Roman" w:hAnsi="Segoe UI" w:cs="Segoe UI"/>
+                <w:kern w:val="0"/>
+                <w:sz w:val="23"/>
+                <w:szCs w:val="23"/>
+                <w:lang w:eastAsia="en-GH"/>
+                <w14:ligatures w14:val="none"/>
+              </w:rPr>
+            </w:pPr>
+          </w:p>
+          <w:p>
+            <w:pPr>
+              <w:spacing w:after="0" w:line="375" w:lineRule="atLeast"/>
+              <w:rPr>
+                <w:rFonts w:ascii="Segoe UI" w:eastAsia="Times New Roman" w:hAnsi="Segoe UI" w:cs="Segoe UI"/>
+                <w:kern w:val="0"/>
+                <w:sz w:val="23"/>
+                <w:szCs w:val="23"/>
+                <w:lang w:eastAsia="en-GH"/>
+                <w14:ligatures w14:val="none"/>
+              </w:rPr>
+            </w:pPr>
+          </w:p>
+          <w:p>
+            <w:pPr>
+              <w:spacing w:after="0" w:line="375" w:lineRule="atLeast"/>
+              <w:rPr>
+                <w:rFonts w:ascii="Segoe UI" w:eastAsia="Times New Roman" w:hAnsi="Segoe UI" w:cs="Segoe UI"/>
+                <w:kern w:val="0"/>
+                <w:sz w:val="23"/>
+                <w:szCs w:val="23"/>
+                <w:lang w:eastAsia="en-GH"/>
+                <w14:ligatures w14:val="none"/>
+              </w:rPr>
+            </w:pPr>
+          </w:p>
+          <w:p>
+            <w:pPr>
+              <w:spacing w:after="0" w:line="375" w:lineRule="atLeast"/>
+              <w:rPr>
+                <w:rFonts w:ascii="Segoe UI" w:eastAsia="Times New Roman" w:hAnsi="Segoe UI" w:cs="Segoe UI"/>
+                <w:kern w:val="0"/>
+                <w:sz w:val="23"/>
+                <w:szCs w:val="23"/>
+                <w:lang w:eastAsia="en-GH"/>
+                <w14:ligatures w14:val="none"/>
+              </w:rPr>
+            </w:pPr>
+            <w:r>
+              <w:rPr>
+                <w:rFonts w:ascii="Segoe UI" w:eastAsia="Times New Roman" w:hAnsi="Segoe UI" w:cs="Segoe UI"/>
+                <w:kern w:val="0"/>
+                <w:sz w:val="23"/>
+                <w:szCs w:val="23"/>
+                <w:lang w:eastAsia="en-GH"/>
+                <w14:ligatures w14:val="none"/>
+              </w:rPr>
+              <w:t>curl -X POST https://hotel-ai-concierge.onrender.com/webhook/whatsapp -H "Content-Type: application/</w:t>
+            </w:r>
+            <w:proofErr w:type="spellStart"/>
+            <w:r>
+              <w:rPr>
+                <w:rFonts w:ascii="Segoe UI" w:eastAsia="Times New Roman" w:hAnsi="Segoe UI" w:cs="Segoe UI"/>
+                <w:kern w:val="0"/>
+                <w:sz w:val="23"/>
+                <w:szCs w:val="23"/>
+                <w:lang w:eastAsia="en-GH"/>
+                <w14:ligatures w14:val="none"/>
+              </w:rPr>
+              <w:t>json</w:t>
+            </w:r>
+            <w:proofErr w:type="spellEnd"/>
+            <w:r>
+              <w:rPr>
+                <w:rFonts w:ascii="Segoe UI" w:eastAsia="Times New Roman" w:hAnsi="Segoe UI" w:cs="Segoe UI"/>
+                <w:kern w:val="0"/>
+                <w:sz w:val="23"/>
+                <w:szCs w:val="23"/>
+                <w:lang w:eastAsia="en-GH"/>
+                <w14:ligatures w14:val="none"/>
+              </w:rPr>
+              <w:t xml:space="preserve">" -d </w:t>
+            </w:r>
+            <w:r>
+              <w:rPr>
+                <w:rFonts w:ascii="Segoe UI" w:eastAsia="Times New Roman" w:hAnsi="Segoe UI" w:cs="Segoe UI"/>
+                <w:kern w:val="0"/>
+                <w:sz w:val="23"/>
+                <w:szCs w:val="23"/>
+                <w:lang w:eastAsia="en-GH"/>
+                <w14:ligatures w14:val="none"/>
+              </w:rPr>
+              <w:lastRenderedPageBreak/>
+              <w:t>"{\"messages\":[{\"from\":\"233243371580\",\"text\":{\"body\":\"What time is breakfast?\"}}]}"</w:t>
+            </w:r>
+          </w:p>
+          <w:p>
+            <w:pPr>
+              <w:spacing w:after="0" w:line="375" w:lineRule="atLeast"/>
+              <w:rPr>
+                <w:rFonts w:ascii="Segoe UI" w:eastAsia="Times New Roman" w:hAnsi="Segoe UI" w:cs="Segoe UI"/>
+                <w:kern w:val="0"/>
+                <w:sz w:val="23"/>
+                <w:szCs w:val="23"/>
+                <w:lang w:eastAsia="en-GH"/>
+                <w14:ligatures w14:val="none"/>
+              </w:rPr>
+            </w:pPr>
+          </w:p>
+          <w:p>
+            <w:pPr>
+              <w:spacing w:after="0" w:line="375" w:lineRule="atLeast"/>
+              <w:rPr>
+                <w:rFonts w:ascii="Segoe UI" w:eastAsia="Times New Roman" w:hAnsi="Segoe UI" w:cs="Segoe UI"/>
+                <w:kern w:val="0"/>
+                <w:sz w:val="23"/>
+                <w:szCs w:val="23"/>
+                <w:lang w:eastAsia="en-GH"/>
+                <w14:ligatures w14:val="none"/>
+              </w:rPr>
+            </w:pPr>
+          </w:p>
+        </w:tc>
+        <w:tc>
+          <w:tcPr>
+            <w:tcW w:w="0" w:type="auto"/>
+            <w:tcMar>
+              <w:top w:w="150" w:type="dxa"/>
+              <w:left w:w="240" w:type="dxa"/>
+              <w:bottom w:w="150" w:type="dxa"/>
+              <w:right w:w="0" w:type="dxa"/>
+            </w:tcMar>
+            <w:vAlign w:val="center"/>
+          </w:tcPr>
+          <w:p>
+            <w:pPr>
+              <w:spacing w:after="0" w:line="375" w:lineRule="atLeast"/>
               <w:rPr>
                 <w:rFonts w:ascii="Consolas" w:eastAsia="Times New Roman" w:hAnsi="Consolas" w:cs="Courier New"/>
                 <w:kern w:val="0"/>
@@ -1284,103 +1258,947 @@
                 <w:lang w:eastAsia="en-GH"/>
                 <w14:ligatures w14:val="none"/>
               </w:rPr>
-              <w:t>":{</w:t>
-            </w:r>
-            <w:proofErr w:type="gramEnd"/>
-            <w:r>
-              <w:rPr>
-                <w:rFonts w:ascii="Consolas" w:eastAsia="Times New Roman" w:hAnsi="Consolas" w:cs="Courier New"/>
-                <w:kern w:val="0"/>
-                <w:sz w:val="20"/>
-                <w:szCs w:val="20"/>
-                <w:shd w:val="clear" w:color="auto" w:fill="EBEEF2"/>
-                <w:lang w:eastAsia="en-GH"/>
-                <w14:ligatures w14:val="none"/>
-              </w:rPr>
-              <w:t>\"text\</w:t>
-            </w:r>
-            <w:proofErr w:type="gramStart"/>
-            <w:r>
-              <w:rPr>
-                <w:rFonts w:ascii="Consolas" w:eastAsia="Times New Roman" w:hAnsi="Consolas" w:cs="Courier New"/>
-                <w:kern w:val="0"/>
-                <w:sz w:val="20"/>
-                <w:szCs w:val="20"/>
-                <w:shd w:val="clear" w:color="auto" w:fill="EBEEF2"/>
-                <w:lang w:eastAsia="en-GH"/>
-                <w14:ligatures w14:val="none"/>
-              </w:rPr>
-              <w:t>":\</w:t>
-            </w:r>
-            <w:proofErr w:type="gramEnd"/>
-            <w:r>
-              <w:rPr>
-                <w:rFonts w:ascii="Consolas" w:eastAsia="Times New Roman" w:hAnsi="Consolas" w:cs="Courier New"/>
-                <w:kern w:val="0"/>
-                <w:sz w:val="20"/>
-                <w:szCs w:val="20"/>
-                <w:shd w:val="clear" w:color="auto" w:fill="EBEEF2"/>
-                <w:lang w:eastAsia="en-GH"/>
-                <w14:ligatures w14:val="none"/>
-              </w:rPr>
-              <w:t>"test\"</w:t>
-            </w:r>
-            <w:proofErr w:type="gramStart"/>
-            <w:r>
-              <w:rPr>
-                <w:rFonts w:ascii="Consolas" w:eastAsia="Times New Roman" w:hAnsi="Consolas" w:cs="Courier New"/>
-                <w:kern w:val="0"/>
-                <w:sz w:val="20"/>
-                <w:szCs w:val="20"/>
-                <w:shd w:val="clear" w:color="auto" w:fill="EBEEF2"/>
-                <w:lang w:eastAsia="en-GH"/>
-                <w14:ligatures w14:val="none"/>
-              </w:rPr>
-              <w:t>},\</w:t>
-            </w:r>
-            <w:proofErr w:type="gramEnd"/>
-            <w:r>
-              <w:rPr>
-                <w:rFonts w:ascii="Consolas" w:eastAsia="Times New Roman" w:hAnsi="Consolas" w:cs="Courier New"/>
-                <w:kern w:val="0"/>
-                <w:sz w:val="20"/>
-                <w:szCs w:val="20"/>
-                <w:shd w:val="clear" w:color="auto" w:fill="EBEEF2"/>
-                <w:lang w:eastAsia="en-GH"/>
-                <w14:ligatures w14:val="none"/>
-              </w:rPr>
-              <w:t>"from\</w:t>
-            </w:r>
-            <w:proofErr w:type="gramStart"/>
-            <w:r>
-              <w:rPr>
-                <w:rFonts w:ascii="Consolas" w:eastAsia="Times New Roman" w:hAnsi="Consolas" w:cs="Courier New"/>
-                <w:kern w:val="0"/>
-                <w:sz w:val="20"/>
-                <w:szCs w:val="20"/>
-                <w:shd w:val="clear" w:color="auto" w:fill="EBEEF2"/>
-                <w:lang w:eastAsia="en-GH"/>
-                <w14:ligatures w14:val="none"/>
-              </w:rPr>
-              <w:t>":\</w:t>
-            </w:r>
-            <w:proofErr w:type="gramEnd"/>
-            <w:r>
-              <w:rPr>
-                <w:rFonts w:ascii="Consolas" w:eastAsia="Times New Roman" w:hAnsi="Consolas" w:cs="Courier New"/>
-                <w:kern w:val="0"/>
-                <w:sz w:val="20"/>
-                <w:szCs w:val="20"/>
-                <w:shd w:val="clear" w:color="auto" w:fill="EBEEF2"/>
-                <w:lang w:eastAsia="en-GH"/>
-                <w14:ligatures w14:val="none"/>
-              </w:rPr>
-              <w:t>"233\"}"</w:t>
-            </w:r>
+            </w:pPr>
           </w:p>
         </w:tc>
       </w:tr>
     </w:tbl>
+    <w:p>
+      <w:pPr>
+        <w:shd w:val="clear" w:color="auto" w:fill="FFFFFF"/>
+        <w:tabs>
+          <w:tab w:val="left" w:pos="916"/>
+          <w:tab w:val="left" w:pos="1832"/>
+          <w:tab w:val="left" w:pos="2748"/>
+          <w:tab w:val="left" w:pos="3664"/>
+          <w:tab w:val="left" w:pos="4580"/>
+          <w:tab w:val="left" w:pos="5496"/>
+          <w:tab w:val="left" w:pos="6412"/>
+          <w:tab w:val="left" w:pos="7328"/>
+          <w:tab w:val="left" w:pos="8244"/>
+          <w:tab w:val="left" w:pos="9160"/>
+          <w:tab w:val="left" w:pos="10076"/>
+          <w:tab w:val="left" w:pos="10992"/>
+          <w:tab w:val="left" w:pos="11908"/>
+          <w:tab w:val="left" w:pos="12824"/>
+          <w:tab w:val="left" w:pos="13740"/>
+          <w:tab w:val="left" w:pos="14656"/>
+        </w:tabs>
+        <w:wordWrap w:val="0"/>
+        <w:spacing w:after="0" w:line="330" w:lineRule="atLeast"/>
+        <w:rPr>
+          <w:rFonts w:ascii="Consolas" w:eastAsia="Times New Roman" w:hAnsi="Consolas" w:cs="Courier New"/>
+          <w:color w:val="0F1115"/>
+          <w:kern w:val="0"/>
+          <w:sz w:val="20"/>
+          <w:szCs w:val="20"/>
+          <w:lang w:eastAsia="en-GH"/>
+          <w14:ligatures w14:val="none"/>
+        </w:rPr>
+      </w:pPr>
+      <w:proofErr w:type="spellStart"/>
+      <w:r>
+        <w:rPr>
+          <w:rFonts w:ascii="Consolas" w:eastAsia="Times New Roman" w:hAnsi="Consolas" w:cs="Courier New"/>
+          <w:color w:val="0F1115"/>
+          <w:kern w:val="0"/>
+          <w:sz w:val="20"/>
+          <w:szCs w:val="20"/>
+          <w:lang w:eastAsia="en-GH"/>
+          <w14:ligatures w14:val="none"/>
+        </w:rPr>
+        <w:t>venv</w:t>
+      </w:r>
+      <w:proofErr w:type="spellEnd"/>
+      <w:r>
+        <w:rPr>
+          <w:rFonts w:ascii="Consolas" w:eastAsia="Times New Roman" w:hAnsi="Consolas" w:cs="Courier New"/>
+          <w:color w:val="0F1115"/>
+          <w:kern w:val="0"/>
+          <w:sz w:val="20"/>
+          <w:szCs w:val="20"/>
+          <w:lang w:eastAsia="en-GH"/>
+          <w14:ligatures w14:val="none"/>
+        </w:rPr>
+        <w:t>\Scripts\activate</w:t>
+      </w:r>
+    </w:p>
+    <w:p>
+      <w:pPr>
+        <w:shd w:val="clear" w:color="auto" w:fill="FFFFFF"/>
+        <w:tabs>
+          <w:tab w:val="left" w:pos="916"/>
+          <w:tab w:val="left" w:pos="1832"/>
+          <w:tab w:val="left" w:pos="2748"/>
+          <w:tab w:val="left" w:pos="3664"/>
+          <w:tab w:val="left" w:pos="4580"/>
+          <w:tab w:val="left" w:pos="5496"/>
+          <w:tab w:val="left" w:pos="6412"/>
+          <w:tab w:val="left" w:pos="7328"/>
+          <w:tab w:val="left" w:pos="8244"/>
+          <w:tab w:val="left" w:pos="9160"/>
+          <w:tab w:val="left" w:pos="10076"/>
+          <w:tab w:val="left" w:pos="10992"/>
+          <w:tab w:val="left" w:pos="11908"/>
+          <w:tab w:val="left" w:pos="12824"/>
+          <w:tab w:val="left" w:pos="13740"/>
+          <w:tab w:val="left" w:pos="14656"/>
+        </w:tabs>
+        <w:wordWrap w:val="0"/>
+        <w:spacing w:after="0" w:line="330" w:lineRule="atLeast"/>
+        <w:rPr>
+          <w:rFonts w:ascii="Consolas" w:eastAsia="Times New Roman" w:hAnsi="Consolas" w:cs="Courier New"/>
+          <w:color w:val="0F1115"/>
+          <w:kern w:val="0"/>
+          <w:sz w:val="20"/>
+          <w:szCs w:val="20"/>
+          <w:lang w:eastAsia="en-GH"/>
+          <w14:ligatures w14:val="none"/>
+        </w:rPr>
+      </w:pPr>
+      <w:r>
+        <w:rPr>
+          <w:rFonts w:ascii="Consolas" w:eastAsia="Times New Roman" w:hAnsi="Consolas" w:cs="Courier New"/>
+          <w:color w:val="0F1115"/>
+          <w:kern w:val="0"/>
+          <w:sz w:val="20"/>
+          <w:szCs w:val="20"/>
+          <w:lang w:eastAsia="en-GH"/>
+          <w14:ligatures w14:val="none"/>
+        </w:rPr>
+        <w:t>python test_ai.py</w:t>
+      </w:r>
+    </w:p>
+    <w:p>
+      <w:pPr>
+        <w:shd w:val="clear" w:color="auto" w:fill="FFFFFF"/>
+        <w:spacing w:before="480" w:after="240" w:line="480" w:lineRule="atLeast"/>
+        <w:outlineLvl w:val="1"/>
+        <w:rPr>
+          <w:rFonts w:ascii="Segoe UI" w:eastAsia="Times New Roman" w:hAnsi="Segoe UI" w:cs="Segoe UI"/>
+          <w:b/>
+          <w:bCs/>
+          <w:color w:val="0F1115"/>
+          <w:kern w:val="0"/>
+          <w:sz w:val="33"/>
+          <w:szCs w:val="33"/>
+          <w:lang w:val="en-GH" w:eastAsia="en-GH"/>
+          <w14:ligatures w14:val="none"/>
+        </w:rPr>
+      </w:pPr>
+      <w:r>
+        <w:rPr>
+          <w:rFonts w:ascii="Segoe UI" w:eastAsia="Times New Roman" w:hAnsi="Segoe UI" w:cs="Segoe UI"/>
+          <w:b/>
+          <w:bCs/>
+          <w:color w:val="0F1115"/>
+          <w:kern w:val="0"/>
+          <w:sz w:val="33"/>
+          <w:szCs w:val="33"/>
+          <w:lang w:val="en-GH" w:eastAsia="en-GH"/>
+          <w14:ligatures w14:val="none"/>
+        </w:rPr>
+        <w:t>Reminders</w:t>
+      </w:r>
+    </w:p>
+    <w:tbl>
+      <w:tblPr>
+        <w:tblW w:w="11280" w:type="dxa"/>
+        <w:tblCellMar>
+          <w:top w:w="15" w:type="dxa"/>
+          <w:left w:w="15" w:type="dxa"/>
+          <w:bottom w:w="15" w:type="dxa"/>
+          <w:right w:w="15" w:type="dxa"/>
+        </w:tblCellMar>
+        <w:tblLook w:val="04A0" w:firstRow="1" w:lastRow="0" w:firstColumn="1" w:lastColumn="0" w:noHBand="0" w:noVBand="1"/>
+      </w:tblPr>
+      <w:tblGrid>
+        <w:gridCol w:w="2627"/>
+        <w:gridCol w:w="8653"/>
+      </w:tblGrid>
+      <w:tr>
+        <w:trPr>
+          <w:tblHeader/>
+        </w:trPr>
+        <w:tc>
+          <w:tcPr>
+            <w:tcW w:w="0" w:type="auto"/>
+            <w:tcBorders>
+              <w:top w:val="nil"/>
+            </w:tcBorders>
+            <w:tcMar>
+              <w:top w:w="150" w:type="dxa"/>
+              <w:left w:w="0" w:type="dxa"/>
+              <w:bottom w:w="150" w:type="dxa"/>
+              <w:right w:w="240" w:type="dxa"/>
+            </w:tcMar>
+            <w:vAlign w:val="center"/>
+            <w:hideMark/>
+          </w:tcPr>
+          <w:p>
+            <w:pPr>
+              <w:spacing w:after="0" w:line="375" w:lineRule="atLeast"/>
+              <w:rPr>
+                <w:rFonts w:ascii="Segoe UI" w:eastAsia="Times New Roman" w:hAnsi="Segoe UI" w:cs="Segoe UI"/>
+                <w:kern w:val="0"/>
+                <w:sz w:val="23"/>
+                <w:szCs w:val="23"/>
+                <w:lang w:val="en-GH" w:eastAsia="en-GH"/>
+                <w14:ligatures w14:val="none"/>
+              </w:rPr>
+            </w:pPr>
+            <w:r>
+              <w:rPr>
+                <w:rFonts w:ascii="Segoe UI" w:eastAsia="Times New Roman" w:hAnsi="Segoe UI" w:cs="Segoe UI"/>
+                <w:kern w:val="0"/>
+                <w:sz w:val="23"/>
+                <w:szCs w:val="23"/>
+                <w:lang w:val="en-GH" w:eastAsia="en-GH"/>
+                <w14:ligatures w14:val="none"/>
+              </w:rPr>
+              <w:t>Task</w:t>
+            </w:r>
+          </w:p>
+        </w:tc>
+        <w:tc>
+          <w:tcPr>
+            <w:tcW w:w="0" w:type="auto"/>
+            <w:tcBorders>
+              <w:top w:val="nil"/>
+            </w:tcBorders>
+            <w:tcMar>
+              <w:top w:w="150" w:type="dxa"/>
+              <w:left w:w="240" w:type="dxa"/>
+              <w:bottom w:w="150" w:type="dxa"/>
+              <w:right w:w="240" w:type="dxa"/>
+            </w:tcMar>
+            <w:vAlign w:val="center"/>
+            <w:hideMark/>
+          </w:tcPr>
+          <w:p>
+            <w:pPr>
+              <w:spacing w:after="0" w:line="375" w:lineRule="atLeast"/>
+              <w:rPr>
+                <w:rFonts w:ascii="Segoe UI" w:eastAsia="Times New Roman" w:hAnsi="Segoe UI" w:cs="Segoe UI"/>
+                <w:kern w:val="0"/>
+                <w:sz w:val="23"/>
+                <w:szCs w:val="23"/>
+                <w:lang w:val="en-GH" w:eastAsia="en-GH"/>
+                <w14:ligatures w14:val="none"/>
+              </w:rPr>
+            </w:pPr>
+            <w:r>
+              <w:rPr>
+                <w:rFonts w:ascii="Segoe UI" w:eastAsia="Times New Roman" w:hAnsi="Segoe UI" w:cs="Segoe UI"/>
+                <w:kern w:val="0"/>
+                <w:sz w:val="23"/>
+                <w:szCs w:val="23"/>
+                <w:lang w:val="en-GH" w:eastAsia="en-GH"/>
+                <w14:ligatures w14:val="none"/>
+              </w:rPr>
+              <w:t>Command/URL</w:t>
+            </w:r>
+          </w:p>
+        </w:tc>
+      </w:tr>
+      <w:tr>
+        <w:tc>
+          <w:tcPr>
+            <w:tcW w:w="0" w:type="auto"/>
+            <w:tcMar>
+              <w:top w:w="150" w:type="dxa"/>
+              <w:left w:w="0" w:type="dxa"/>
+              <w:bottom w:w="150" w:type="dxa"/>
+              <w:right w:w="240" w:type="dxa"/>
+            </w:tcMar>
+            <w:vAlign w:val="center"/>
+            <w:hideMark/>
+          </w:tcPr>
+          <w:p>
+            <w:pPr>
+              <w:spacing w:after="0" w:line="375" w:lineRule="atLeast"/>
+              <w:rPr>
+                <w:rFonts w:ascii="Segoe UI" w:eastAsia="Times New Roman" w:hAnsi="Segoe UI" w:cs="Segoe UI"/>
+                <w:kern w:val="0"/>
+                <w:sz w:val="23"/>
+                <w:szCs w:val="23"/>
+                <w:lang w:val="en-GH" w:eastAsia="en-GH"/>
+                <w14:ligatures w14:val="none"/>
+              </w:rPr>
+            </w:pPr>
+            <w:r>
+              <w:rPr>
+                <w:rFonts w:ascii="Segoe UI" w:eastAsia="Times New Roman" w:hAnsi="Segoe UI" w:cs="Segoe UI"/>
+                <w:kern w:val="0"/>
+                <w:sz w:val="23"/>
+                <w:szCs w:val="23"/>
+                <w:lang w:val="en-GH" w:eastAsia="en-GH"/>
+                <w14:ligatures w14:val="none"/>
+              </w:rPr>
+              <w:t xml:space="preserve">Activate </w:t>
+            </w:r>
+            <w:proofErr w:type="spellStart"/>
+            <w:r>
+              <w:rPr>
+                <w:rFonts w:ascii="Segoe UI" w:eastAsia="Times New Roman" w:hAnsi="Segoe UI" w:cs="Segoe UI"/>
+                <w:kern w:val="0"/>
+                <w:sz w:val="23"/>
+                <w:szCs w:val="23"/>
+                <w:lang w:val="en-GH" w:eastAsia="en-GH"/>
+                <w14:ligatures w14:val="none"/>
+              </w:rPr>
+              <w:t>venv</w:t>
+            </w:r>
+            <w:proofErr w:type="spellEnd"/>
+          </w:p>
+        </w:tc>
+        <w:tc>
+          <w:tcPr>
+            <w:tcW w:w="0" w:type="auto"/>
+            <w:tcMar>
+              <w:top w:w="150" w:type="dxa"/>
+              <w:left w:w="240" w:type="dxa"/>
+              <w:bottom w:w="150" w:type="dxa"/>
+              <w:right w:w="0" w:type="dxa"/>
+            </w:tcMar>
+            <w:vAlign w:val="center"/>
+            <w:hideMark/>
+          </w:tcPr>
+          <w:p>
+            <w:pPr>
+              <w:spacing w:after="0" w:line="375" w:lineRule="atLeast"/>
+              <w:rPr>
+                <w:rFonts w:ascii="Segoe UI" w:eastAsia="Times New Roman" w:hAnsi="Segoe UI" w:cs="Segoe UI"/>
+                <w:kern w:val="0"/>
+                <w:sz w:val="23"/>
+                <w:szCs w:val="23"/>
+                <w:lang w:val="en-GH" w:eastAsia="en-GH"/>
+                <w14:ligatures w14:val="none"/>
+              </w:rPr>
+            </w:pPr>
+            <w:proofErr w:type="spellStart"/>
+            <w:r>
+              <w:rPr>
+                <w:rFonts w:ascii="Consolas" w:eastAsia="Times New Roman" w:hAnsi="Consolas" w:cs="Courier New"/>
+                <w:kern w:val="0"/>
+                <w:sz w:val="20"/>
+                <w:szCs w:val="20"/>
+                <w:shd w:val="clear" w:color="auto" w:fill="EBEEF2"/>
+                <w:lang w:val="en-GH" w:eastAsia="en-GH"/>
+                <w14:ligatures w14:val="none"/>
+              </w:rPr>
+              <w:t>venv</w:t>
+            </w:r>
+            <w:proofErr w:type="spellEnd"/>
+            <w:r>
+              <w:rPr>
+                <w:rFonts w:ascii="Consolas" w:eastAsia="Times New Roman" w:hAnsi="Consolas" w:cs="Courier New"/>
+                <w:kern w:val="0"/>
+                <w:sz w:val="20"/>
+                <w:szCs w:val="20"/>
+                <w:shd w:val="clear" w:color="auto" w:fill="EBEEF2"/>
+                <w:lang w:val="en-GH" w:eastAsia="en-GH"/>
+                <w14:ligatures w14:val="none"/>
+              </w:rPr>
+              <w:t>\Scripts\activate</w:t>
+            </w:r>
+          </w:p>
+        </w:tc>
+      </w:tr>
+      <w:tr>
+        <w:tc>
+          <w:tcPr>
+            <w:tcW w:w="0" w:type="auto"/>
+            <w:tcMar>
+              <w:top w:w="150" w:type="dxa"/>
+              <w:left w:w="0" w:type="dxa"/>
+              <w:bottom w:w="150" w:type="dxa"/>
+              <w:right w:w="240" w:type="dxa"/>
+            </w:tcMar>
+            <w:vAlign w:val="center"/>
+            <w:hideMark/>
+          </w:tcPr>
+          <w:p>
+            <w:pPr>
+              <w:spacing w:after="0" w:line="375" w:lineRule="atLeast"/>
+              <w:rPr>
+                <w:rFonts w:ascii="Segoe UI" w:eastAsia="Times New Roman" w:hAnsi="Segoe UI" w:cs="Segoe UI"/>
+                <w:kern w:val="0"/>
+                <w:sz w:val="23"/>
+                <w:szCs w:val="23"/>
+                <w:lang w:val="en-GH" w:eastAsia="en-GH"/>
+                <w14:ligatures w14:val="none"/>
+              </w:rPr>
+            </w:pPr>
+            <w:r>
+              <w:rPr>
+                <w:rFonts w:ascii="Segoe UI" w:eastAsia="Times New Roman" w:hAnsi="Segoe UI" w:cs="Segoe UI"/>
+                <w:kern w:val="0"/>
+                <w:sz w:val="23"/>
+                <w:szCs w:val="23"/>
+                <w:lang w:val="en-GH" w:eastAsia="en-GH"/>
+                <w14:ligatures w14:val="none"/>
+              </w:rPr>
+              <w:t>Run locally</w:t>
+            </w:r>
+          </w:p>
+        </w:tc>
+        <w:tc>
+          <w:tcPr>
+            <w:tcW w:w="0" w:type="auto"/>
+            <w:tcMar>
+              <w:top w:w="150" w:type="dxa"/>
+              <w:left w:w="240" w:type="dxa"/>
+              <w:bottom w:w="150" w:type="dxa"/>
+              <w:right w:w="0" w:type="dxa"/>
+            </w:tcMar>
+            <w:vAlign w:val="center"/>
+            <w:hideMark/>
+          </w:tcPr>
+          <w:p>
+            <w:pPr>
+              <w:spacing w:after="0" w:line="375" w:lineRule="atLeast"/>
+              <w:rPr>
+                <w:rFonts w:ascii="Segoe UI" w:eastAsia="Times New Roman" w:hAnsi="Segoe UI" w:cs="Segoe UI"/>
+                <w:kern w:val="0"/>
+                <w:sz w:val="23"/>
+                <w:szCs w:val="23"/>
+                <w:lang w:val="en-GH" w:eastAsia="en-GH"/>
+                <w14:ligatures w14:val="none"/>
+              </w:rPr>
+            </w:pPr>
+            <w:proofErr w:type="spellStart"/>
+            <w:r>
+              <w:rPr>
+                <w:rFonts w:ascii="Consolas" w:eastAsia="Times New Roman" w:hAnsi="Consolas" w:cs="Courier New"/>
+                <w:kern w:val="0"/>
+                <w:sz w:val="20"/>
+                <w:szCs w:val="20"/>
+                <w:shd w:val="clear" w:color="auto" w:fill="EBEEF2"/>
+                <w:lang w:val="en-GH" w:eastAsia="en-GH"/>
+                <w14:ligatures w14:val="none"/>
+              </w:rPr>
+              <w:t>uvicorn</w:t>
+            </w:r>
+            <w:proofErr w:type="spellEnd"/>
+            <w:r>
+              <w:rPr>
+                <w:rFonts w:ascii="Consolas" w:eastAsia="Times New Roman" w:hAnsi="Consolas" w:cs="Courier New"/>
+                <w:kern w:val="0"/>
+                <w:sz w:val="20"/>
+                <w:szCs w:val="20"/>
+                <w:shd w:val="clear" w:color="auto" w:fill="EBEEF2"/>
+                <w:lang w:val="en-GH" w:eastAsia="en-GH"/>
+                <w14:ligatures w14:val="none"/>
+              </w:rPr>
+              <w:t xml:space="preserve"> </w:t>
+            </w:r>
+            <w:proofErr w:type="spellStart"/>
+            <w:r>
+              <w:rPr>
+                <w:rFonts w:ascii="Consolas" w:eastAsia="Times New Roman" w:hAnsi="Consolas" w:cs="Courier New"/>
+                <w:kern w:val="0"/>
+                <w:sz w:val="20"/>
+                <w:szCs w:val="20"/>
+                <w:shd w:val="clear" w:color="auto" w:fill="EBEEF2"/>
+                <w:lang w:val="en-GH" w:eastAsia="en-GH"/>
+                <w14:ligatures w14:val="none"/>
+              </w:rPr>
+              <w:t>app.main:app</w:t>
+            </w:r>
+            <w:proofErr w:type="spellEnd"/>
+            <w:r>
+              <w:rPr>
+                <w:rFonts w:ascii="Consolas" w:eastAsia="Times New Roman" w:hAnsi="Consolas" w:cs="Courier New"/>
+                <w:kern w:val="0"/>
+                <w:sz w:val="20"/>
+                <w:szCs w:val="20"/>
+                <w:shd w:val="clear" w:color="auto" w:fill="EBEEF2"/>
+                <w:lang w:val="en-GH" w:eastAsia="en-GH"/>
+                <w14:ligatures w14:val="none"/>
+              </w:rPr>
+              <w:t xml:space="preserve"> --reload</w:t>
+            </w:r>
+          </w:p>
+        </w:tc>
+      </w:tr>
+      <w:tr>
+        <w:tc>
+          <w:tcPr>
+            <w:tcW w:w="0" w:type="auto"/>
+            <w:tcMar>
+              <w:top w:w="150" w:type="dxa"/>
+              <w:left w:w="0" w:type="dxa"/>
+              <w:bottom w:w="150" w:type="dxa"/>
+              <w:right w:w="240" w:type="dxa"/>
+            </w:tcMar>
+            <w:vAlign w:val="center"/>
+            <w:hideMark/>
+          </w:tcPr>
+          <w:p>
+            <w:pPr>
+              <w:spacing w:after="0" w:line="375" w:lineRule="atLeast"/>
+              <w:rPr>
+                <w:rFonts w:ascii="Segoe UI" w:eastAsia="Times New Roman" w:hAnsi="Segoe UI" w:cs="Segoe UI"/>
+                <w:kern w:val="0"/>
+                <w:sz w:val="23"/>
+                <w:szCs w:val="23"/>
+                <w:lang w:val="en-GH" w:eastAsia="en-GH"/>
+                <w14:ligatures w14:val="none"/>
+              </w:rPr>
+            </w:pPr>
+            <w:r>
+              <w:rPr>
+                <w:rFonts w:ascii="Segoe UI" w:eastAsia="Times New Roman" w:hAnsi="Segoe UI" w:cs="Segoe UI"/>
+                <w:kern w:val="0"/>
+                <w:sz w:val="23"/>
+                <w:szCs w:val="23"/>
+                <w:lang w:val="en-GH" w:eastAsia="en-GH"/>
+                <w14:ligatures w14:val="none"/>
+              </w:rPr>
+              <w:t>Admin panel</w:t>
+            </w:r>
+          </w:p>
+        </w:tc>
+        <w:tc>
+          <w:tcPr>
+            <w:tcW w:w="0" w:type="auto"/>
+            <w:tcMar>
+              <w:top w:w="150" w:type="dxa"/>
+              <w:left w:w="240" w:type="dxa"/>
+              <w:bottom w:w="150" w:type="dxa"/>
+              <w:right w:w="0" w:type="dxa"/>
+            </w:tcMar>
+            <w:vAlign w:val="center"/>
+            <w:hideMark/>
+          </w:tcPr>
+          <w:p>
+            <w:pPr>
+              <w:spacing w:after="0" w:line="375" w:lineRule="atLeast"/>
+              <w:rPr>
+                <w:rFonts w:ascii="Segoe UI" w:eastAsia="Times New Roman" w:hAnsi="Segoe UI" w:cs="Segoe UI"/>
+                <w:kern w:val="0"/>
+                <w:sz w:val="23"/>
+                <w:szCs w:val="23"/>
+                <w:lang w:val="en-GH" w:eastAsia="en-GH"/>
+                <w14:ligatures w14:val="none"/>
+              </w:rPr>
+            </w:pPr>
+            <w:r>
+              <w:rPr>
+                <w:rFonts w:ascii="Consolas" w:eastAsia="Times New Roman" w:hAnsi="Consolas" w:cs="Courier New"/>
+                <w:kern w:val="0"/>
+                <w:sz w:val="20"/>
+                <w:szCs w:val="20"/>
+                <w:shd w:val="clear" w:color="auto" w:fill="EBEEF2"/>
+                <w:lang w:val="en-GH" w:eastAsia="en-GH"/>
+                <w14:ligatures w14:val="none"/>
+              </w:rPr>
+              <w:t>http://localhost:8000/admin</w:t>
+            </w:r>
+          </w:p>
+        </w:tc>
+      </w:tr>
+      <w:tr>
+        <w:tc>
+          <w:tcPr>
+            <w:tcW w:w="0" w:type="auto"/>
+            <w:tcMar>
+              <w:top w:w="150" w:type="dxa"/>
+              <w:left w:w="0" w:type="dxa"/>
+              <w:bottom w:w="150" w:type="dxa"/>
+              <w:right w:w="240" w:type="dxa"/>
+            </w:tcMar>
+            <w:vAlign w:val="center"/>
+            <w:hideMark/>
+          </w:tcPr>
+          <w:p>
+            <w:pPr>
+              <w:spacing w:after="0" w:line="375" w:lineRule="atLeast"/>
+              <w:rPr>
+                <w:rFonts w:ascii="Segoe UI" w:eastAsia="Times New Roman" w:hAnsi="Segoe UI" w:cs="Segoe UI"/>
+                <w:kern w:val="0"/>
+                <w:sz w:val="23"/>
+                <w:szCs w:val="23"/>
+                <w:lang w:val="en-GH" w:eastAsia="en-GH"/>
+                <w14:ligatures w14:val="none"/>
+              </w:rPr>
+            </w:pPr>
+            <w:r>
+              <w:rPr>
+                <w:rFonts w:ascii="Segoe UI" w:eastAsia="Times New Roman" w:hAnsi="Segoe UI" w:cs="Segoe UI"/>
+                <w:kern w:val="0"/>
+                <w:sz w:val="23"/>
+                <w:szCs w:val="23"/>
+                <w:lang w:val="en-GH" w:eastAsia="en-GH"/>
+                <w14:ligatures w14:val="none"/>
+              </w:rPr>
+              <w:t>Live health check</w:t>
+            </w:r>
+          </w:p>
+        </w:tc>
+        <w:tc>
+          <w:tcPr>
+            <w:tcW w:w="0" w:type="auto"/>
+            <w:tcMar>
+              <w:top w:w="150" w:type="dxa"/>
+              <w:left w:w="240" w:type="dxa"/>
+              <w:bottom w:w="150" w:type="dxa"/>
+              <w:right w:w="0" w:type="dxa"/>
+            </w:tcMar>
+            <w:vAlign w:val="center"/>
+            <w:hideMark/>
+          </w:tcPr>
+          <w:p>
+            <w:pPr>
+              <w:spacing w:after="0" w:line="375" w:lineRule="atLeast"/>
+              <w:rPr>
+                <w:rFonts w:ascii="Segoe UI" w:eastAsia="Times New Roman" w:hAnsi="Segoe UI" w:cs="Segoe UI"/>
+                <w:kern w:val="0"/>
+                <w:sz w:val="23"/>
+                <w:szCs w:val="23"/>
+                <w:lang w:val="en-GH" w:eastAsia="en-GH"/>
+                <w14:ligatures w14:val="none"/>
+              </w:rPr>
+            </w:pPr>
+            <w:r>
+              <w:rPr>
+                <w:rFonts w:ascii="Consolas" w:eastAsia="Times New Roman" w:hAnsi="Consolas" w:cs="Courier New"/>
+                <w:kern w:val="0"/>
+                <w:sz w:val="20"/>
+                <w:szCs w:val="20"/>
+                <w:shd w:val="clear" w:color="auto" w:fill="EBEEF2"/>
+                <w:lang w:val="en-GH" w:eastAsia="en-GH"/>
+                <w14:ligatures w14:val="none"/>
+              </w:rPr>
+              <w:t>https://hotel-ai-concierge.onrender.com/health</w:t>
+            </w:r>
+          </w:p>
+        </w:tc>
+      </w:tr>
+      <w:tr>
+        <w:tc>
+          <w:tcPr>
+            <w:tcW w:w="0" w:type="auto"/>
+            <w:tcMar>
+              <w:top w:w="150" w:type="dxa"/>
+              <w:left w:w="0" w:type="dxa"/>
+              <w:bottom w:w="150" w:type="dxa"/>
+              <w:right w:w="240" w:type="dxa"/>
+            </w:tcMar>
+            <w:vAlign w:val="center"/>
+            <w:hideMark/>
+          </w:tcPr>
+          <w:p>
+            <w:pPr>
+              <w:spacing w:after="0" w:line="375" w:lineRule="atLeast"/>
+              <w:rPr>
+                <w:rFonts w:ascii="Segoe UI" w:eastAsia="Times New Roman" w:hAnsi="Segoe UI" w:cs="Segoe UI"/>
+                <w:kern w:val="0"/>
+                <w:sz w:val="23"/>
+                <w:szCs w:val="23"/>
+                <w:lang w:val="en-GH" w:eastAsia="en-GH"/>
+                <w14:ligatures w14:val="none"/>
+              </w:rPr>
+            </w:pPr>
+            <w:r>
+              <w:rPr>
+                <w:rFonts w:ascii="Segoe UI" w:eastAsia="Times New Roman" w:hAnsi="Segoe UI" w:cs="Segoe UI"/>
+                <w:kern w:val="0"/>
+                <w:sz w:val="23"/>
+                <w:szCs w:val="23"/>
+                <w:lang w:val="en-GH" w:eastAsia="en-GH"/>
+                <w14:ligatures w14:val="none"/>
+              </w:rPr>
+              <w:t>Push to GitHub</w:t>
+            </w:r>
+          </w:p>
+        </w:tc>
+        <w:tc>
+          <w:tcPr>
+            <w:tcW w:w="0" w:type="auto"/>
+            <w:tcMar>
+              <w:top w:w="150" w:type="dxa"/>
+              <w:left w:w="240" w:type="dxa"/>
+              <w:bottom w:w="150" w:type="dxa"/>
+              <w:right w:w="0" w:type="dxa"/>
+            </w:tcMar>
+            <w:vAlign w:val="center"/>
+            <w:hideMark/>
+          </w:tcPr>
+          <w:p>
+            <w:pPr>
+              <w:spacing w:after="0" w:line="375" w:lineRule="atLeast"/>
+              <w:rPr>
+                <w:rFonts w:ascii="Segoe UI" w:eastAsia="Times New Roman" w:hAnsi="Segoe UI" w:cs="Segoe UI"/>
+                <w:kern w:val="0"/>
+                <w:sz w:val="23"/>
+                <w:szCs w:val="23"/>
+                <w:lang w:val="en-GH" w:eastAsia="en-GH"/>
+                <w14:ligatures w14:val="none"/>
+              </w:rPr>
+            </w:pPr>
+            <w:r>
+              <w:rPr>
+                <w:rFonts w:ascii="Consolas" w:eastAsia="Times New Roman" w:hAnsi="Consolas" w:cs="Courier New"/>
+                <w:kern w:val="0"/>
+                <w:sz w:val="20"/>
+                <w:szCs w:val="20"/>
+                <w:shd w:val="clear" w:color="auto" w:fill="EBEEF2"/>
+                <w:lang w:val="en-GH" w:eastAsia="en-GH"/>
+                <w14:ligatures w14:val="none"/>
+              </w:rPr>
+              <w:t>git add .</w:t>
+            </w:r>
+            <w:r>
+              <w:rPr>
+                <w:rFonts w:ascii="Segoe UI" w:eastAsia="Times New Roman" w:hAnsi="Segoe UI" w:cs="Segoe UI"/>
+                <w:kern w:val="0"/>
+                <w:sz w:val="23"/>
+                <w:szCs w:val="23"/>
+                <w:lang w:val="en-GH" w:eastAsia="en-GH"/>
+                <w14:ligatures w14:val="none"/>
+              </w:rPr>
+              <w:t> → </w:t>
+            </w:r>
+            <w:r>
+              <w:rPr>
+                <w:rFonts w:ascii="Consolas" w:eastAsia="Times New Roman" w:hAnsi="Consolas" w:cs="Courier New"/>
+                <w:kern w:val="0"/>
+                <w:sz w:val="20"/>
+                <w:szCs w:val="20"/>
+                <w:shd w:val="clear" w:color="auto" w:fill="EBEEF2"/>
+                <w:lang w:val="en-GH" w:eastAsia="en-GH"/>
+                <w14:ligatures w14:val="none"/>
+              </w:rPr>
+              <w:t>git commit -m "msg"</w:t>
+            </w:r>
+            <w:r>
+              <w:rPr>
+                <w:rFonts w:ascii="Segoe UI" w:eastAsia="Times New Roman" w:hAnsi="Segoe UI" w:cs="Segoe UI"/>
+                <w:kern w:val="0"/>
+                <w:sz w:val="23"/>
+                <w:szCs w:val="23"/>
+                <w:lang w:val="en-GH" w:eastAsia="en-GH"/>
+                <w14:ligatures w14:val="none"/>
+              </w:rPr>
+              <w:t> → </w:t>
+            </w:r>
+            <w:r>
+              <w:rPr>
+                <w:rFonts w:ascii="Consolas" w:eastAsia="Times New Roman" w:hAnsi="Consolas" w:cs="Courier New"/>
+                <w:kern w:val="0"/>
+                <w:sz w:val="20"/>
+                <w:szCs w:val="20"/>
+                <w:shd w:val="clear" w:color="auto" w:fill="EBEEF2"/>
+                <w:lang w:val="en-GH" w:eastAsia="en-GH"/>
+                <w14:ligatures w14:val="none"/>
+              </w:rPr>
+              <w:t>git push</w:t>
+            </w:r>
+          </w:p>
+        </w:tc>
+      </w:tr>
+      <w:tr>
+        <w:tc>
+          <w:tcPr>
+            <w:tcW w:w="0" w:type="auto"/>
+            <w:tcMar>
+              <w:top w:w="150" w:type="dxa"/>
+              <w:left w:w="0" w:type="dxa"/>
+              <w:bottom w:w="150" w:type="dxa"/>
+              <w:right w:w="240" w:type="dxa"/>
+            </w:tcMar>
+            <w:vAlign w:val="center"/>
+            <w:hideMark/>
+          </w:tcPr>
+          <w:p>
+            <w:pPr>
+              <w:spacing w:after="0" w:line="375" w:lineRule="atLeast"/>
+              <w:rPr>
+                <w:rFonts w:ascii="Segoe UI" w:eastAsia="Times New Roman" w:hAnsi="Segoe UI" w:cs="Segoe UI"/>
+                <w:kern w:val="0"/>
+                <w:sz w:val="23"/>
+                <w:szCs w:val="23"/>
+                <w:lang w:val="en-GH" w:eastAsia="en-GH"/>
+                <w14:ligatures w14:val="none"/>
+              </w:rPr>
+            </w:pPr>
+            <w:r>
+              <w:rPr>
+                <w:rFonts w:ascii="Segoe UI" w:eastAsia="Times New Roman" w:hAnsi="Segoe UI" w:cs="Segoe UI"/>
+                <w:kern w:val="0"/>
+                <w:sz w:val="23"/>
+                <w:szCs w:val="23"/>
+                <w:lang w:val="en-GH" w:eastAsia="en-GH"/>
+                <w14:ligatures w14:val="none"/>
+              </w:rPr>
+              <w:t>Redeploy</w:t>
+            </w:r>
+          </w:p>
+        </w:tc>
+        <w:tc>
+          <w:tcPr>
+            <w:tcW w:w="0" w:type="auto"/>
+            <w:tcMar>
+              <w:top w:w="150" w:type="dxa"/>
+              <w:left w:w="240" w:type="dxa"/>
+              <w:bottom w:w="150" w:type="dxa"/>
+              <w:right w:w="0" w:type="dxa"/>
+            </w:tcMar>
+            <w:vAlign w:val="center"/>
+            <w:hideMark/>
+          </w:tcPr>
+          <w:p>
+            <w:pPr>
+              <w:spacing w:after="0" w:line="375" w:lineRule="atLeast"/>
+              <w:rPr>
+                <w:rFonts w:ascii="Segoe UI" w:eastAsia="Times New Roman" w:hAnsi="Segoe UI" w:cs="Segoe UI"/>
+                <w:kern w:val="0"/>
+                <w:sz w:val="23"/>
+                <w:szCs w:val="23"/>
+                <w:lang w:val="en-GH" w:eastAsia="en-GH"/>
+                <w14:ligatures w14:val="none"/>
+              </w:rPr>
+            </w:pPr>
+            <w:r>
+              <w:rPr>
+                <w:rFonts w:ascii="Segoe UI" w:eastAsia="Times New Roman" w:hAnsi="Segoe UI" w:cs="Segoe UI"/>
+                <w:kern w:val="0"/>
+                <w:sz w:val="23"/>
+                <w:szCs w:val="23"/>
+                <w:lang w:val="en-GH" w:eastAsia="en-GH"/>
+                <w14:ligatures w14:val="none"/>
+              </w:rPr>
+              <w:t>Render Dashboard → Manual Deploy → Deploy latest commit</w:t>
+            </w:r>
+          </w:p>
+        </w:tc>
+      </w:tr>
+    </w:tbl>
+    <w:p>
+      <w:pPr>
+        <w:shd w:val="clear" w:color="auto" w:fill="FFFFFF"/>
+        <w:spacing w:before="240" w:after="0" w:line="240" w:lineRule="auto"/>
+        <w:rPr>
+          <w:rFonts w:ascii="Segoe UI" w:eastAsia="Times New Roman" w:hAnsi="Segoe UI" w:cs="Segoe UI"/>
+          <w:color w:val="0F1115"/>
+          <w:kern w:val="0"/>
+          <w:lang w:val="en-GH" w:eastAsia="en-GH"/>
+          <w14:ligatures w14:val="none"/>
+        </w:rPr>
+      </w:pPr>
+      <w:r>
+        <w:rPr>
+          <w:rFonts w:ascii="Segoe UI" w:eastAsia="Times New Roman" w:hAnsi="Segoe UI" w:cs="Segoe UI"/>
+          <w:color w:val="0F1115"/>
+          <w:kern w:val="0"/>
+          <w:lang w:val="en-GH" w:eastAsia="en-GH"/>
+          <w14:ligatures w14:val="none"/>
+        </w:rPr>
+        <w:t>That</w:t>
+      </w:r>
+    </w:p>
+    <w:p>
+      <w:pPr>
+        <w:shd w:val="clear" w:color="auto" w:fill="FFFFFF"/>
+        <w:spacing w:before="480" w:after="240" w:line="480" w:lineRule="atLeast"/>
+        <w:outlineLvl w:val="1"/>
+        <w:rPr>
+          <w:rFonts w:ascii="Segoe UI Emoji" w:eastAsia="Times New Roman" w:hAnsi="Segoe UI Emoji" w:cs="Segoe UI Emoji"/>
+          <w:b/>
+          <w:bCs/>
+          <w:color w:val="0F1115"/>
+          <w:kern w:val="0"/>
+          <w:sz w:val="33"/>
+          <w:szCs w:val="33"/>
+          <w:lang w:eastAsia="en-GH"/>
+          <w14:ligatures w14:val="none"/>
+        </w:rPr>
+      </w:pPr>
+    </w:p>
+    <w:p>
+      <w:pPr>
+        <w:shd w:val="clear" w:color="auto" w:fill="FFFFFF"/>
+        <w:spacing w:before="480" w:after="240" w:line="480" w:lineRule="atLeast"/>
+        <w:outlineLvl w:val="1"/>
+        <w:rPr>
+          <w:rFonts w:ascii="Segoe UI Emoji" w:eastAsia="Times New Roman" w:hAnsi="Segoe UI Emoji" w:cs="Segoe UI Emoji"/>
+          <w:b/>
+          <w:bCs/>
+          <w:color w:val="0F1115"/>
+          <w:kern w:val="0"/>
+          <w:sz w:val="33"/>
+          <w:szCs w:val="33"/>
+          <w:lang w:eastAsia="en-GH"/>
+          <w14:ligatures w14:val="none"/>
+        </w:rPr>
+      </w:pPr>
+    </w:p>
+    <w:p>
+      <w:pPr>
+        <w:shd w:val="clear" w:color="auto" w:fill="FFFFFF"/>
+        <w:spacing w:before="480" w:after="240" w:line="480" w:lineRule="atLeast"/>
+        <w:outlineLvl w:val="1"/>
+        <w:rPr>
+          <w:rFonts w:ascii="Segoe UI Emoji" w:eastAsia="Times New Roman" w:hAnsi="Segoe UI Emoji" w:cs="Segoe UI Emoji"/>
+          <w:b/>
+          <w:bCs/>
+          <w:color w:val="0F1115"/>
+          <w:kern w:val="0"/>
+          <w:sz w:val="33"/>
+          <w:szCs w:val="33"/>
+          <w:lang w:eastAsia="en-GH"/>
+          <w14:ligatures w14:val="none"/>
+        </w:rPr>
+      </w:pPr>
+    </w:p>
+    <w:p>
+      <w:pPr>
+        <w:shd w:val="clear" w:color="auto" w:fill="FFFFFF"/>
+        <w:spacing w:before="480" w:after="240" w:line="480" w:lineRule="atLeast"/>
+        <w:outlineLvl w:val="1"/>
+        <w:rPr>
+          <w:rFonts w:ascii="Segoe UI" w:eastAsia="Times New Roman" w:hAnsi="Segoe UI" w:cs="Segoe UI"/>
+          <w:b/>
+          <w:bCs/>
+          <w:color w:val="0F1115"/>
+          <w:kern w:val="0"/>
+          <w:sz w:val="33"/>
+          <w:szCs w:val="33"/>
+          <w:lang w:eastAsia="en-GH"/>
+          <w14:ligatures w14:val="none"/>
+        </w:rPr>
+      </w:pPr>
+      <w:r>
+        <w:rPr>
+          <w:rFonts w:ascii="Segoe UI Emoji" w:eastAsia="Times New Roman" w:hAnsi="Segoe UI Emoji" w:cs="Segoe UI Emoji"/>
+          <w:b/>
+          <w:bCs/>
+          <w:color w:val="0F1115"/>
+          <w:kern w:val="0"/>
+          <w:sz w:val="33"/>
+          <w:szCs w:val="33"/>
+          <w:lang w:eastAsia="en-GH"/>
+          <w14:ligatures w14:val="none"/>
+        </w:rPr>
+        <w:t>📋</w:t>
+      </w:r>
+      <w:r>
+        <w:rPr>
+          <w:rFonts w:ascii="Segoe UI" w:eastAsia="Times New Roman" w:hAnsi="Segoe UI" w:cs="Segoe UI"/>
+          <w:b/>
+          <w:bCs/>
+          <w:color w:val="0F1115"/>
+          <w:kern w:val="0"/>
+          <w:sz w:val="33"/>
+          <w:szCs w:val="33"/>
+          <w:lang w:eastAsia="en-GH"/>
+          <w14:ligatures w14:val="none"/>
+        </w:rPr>
+        <w:t xml:space="preserve"> Commands Summary</w:t>
+      </w:r>
+    </w:p>
     <w:p>
       <w:pPr>
         <w:shd w:val="clear" w:color="auto" w:fill="FFFFFF"/>
@@ -4488,31 +5306,17 @@
         <w:t xml:space="preserve"> </w:t>
       </w:r>
       <w:proofErr w:type="spellStart"/>
-      <w:proofErr w:type="gramStart"/>
-      <w:r>
-        <w:rPr>
-          <w:rFonts w:ascii="Consolas" w:eastAsia="Times New Roman" w:hAnsi="Consolas" w:cs="Courier New"/>
-          <w:color w:val="0F1115"/>
-          <w:kern w:val="0"/>
-          <w:sz w:val="20"/>
-          <w:szCs w:val="20"/>
-          <w:lang w:eastAsia="en-GH"/>
-          <w14:ligatures w14:val="none"/>
-        </w:rPr>
-        <w:t>app.main</w:t>
-      </w:r>
-      <w:proofErr w:type="gramEnd"/>
-      <w:r>
-        <w:rPr>
-          <w:rFonts w:ascii="Consolas" w:eastAsia="Times New Roman" w:hAnsi="Consolas" w:cs="Courier New"/>
-          <w:color w:val="0F1115"/>
-          <w:kern w:val="0"/>
-          <w:sz w:val="20"/>
-          <w:szCs w:val="20"/>
-          <w:lang w:eastAsia="en-GH"/>
-          <w14:ligatures w14:val="none"/>
-        </w:rPr>
-        <w:t>:app</w:t>
+      <w:r>
+        <w:rPr>
+          <w:rFonts w:ascii="Consolas" w:eastAsia="Times New Roman" w:hAnsi="Consolas" w:cs="Courier New"/>
+          <w:color w:val="0F1115"/>
+          <w:kern w:val="0"/>
+          <w:sz w:val="20"/>
+          <w:szCs w:val="20"/>
+          <w:lang w:eastAsia="en-GH"/>
+          <w14:ligatures w14:val="none"/>
+        </w:rPr>
+        <w:t>app.main:app</w:t>
       </w:r>
       <w:proofErr w:type="spellEnd"/>
       <w:r>
@@ -6268,31 +7072,7 @@
             <w:lang w:eastAsia="en-GH"/>
             <w14:ligatures w14:val="none"/>
           </w:rPr>
-          <w:t>Render.</w:t>
-        </w:r>
-        <w:r>
-          <w:rPr>
-            <w:rFonts w:ascii="Segoe UI" w:eastAsia="Times New Roman" w:hAnsi="Segoe UI" w:cs="Segoe UI"/>
-            <w:color w:val="3964FE"/>
-            <w:kern w:val="0"/>
-            <w:u w:val="single"/>
-            <w:bdr w:val="single" w:sz="8" w:space="0" w:color="auto" w:frame="1"/>
-            <w:lang w:eastAsia="en-GH"/>
-            <w14:ligatures w14:val="none"/>
-          </w:rPr>
-          <w:t>c</w:t>
-        </w:r>
-        <w:r>
-          <w:rPr>
-            <w:rFonts w:ascii="Segoe UI" w:eastAsia="Times New Roman" w:hAnsi="Segoe UI" w:cs="Segoe UI"/>
-            <w:color w:val="3964FE"/>
-            <w:kern w:val="0"/>
-            <w:u w:val="single"/>
-            <w:bdr w:val="single" w:sz="8" w:space="0" w:color="auto" w:frame="1"/>
-            <w:lang w:eastAsia="en-GH"/>
-            <w14:ligatures w14:val="none"/>
-          </w:rPr>
-          <w:t>om</w:t>
+          <w:t>Render.com</w:t>
         </w:r>
       </w:hyperlink>
       <w:r>
@@ -6781,33 +7561,7 @@
           <w:lang w:eastAsia="en-GH"/>
           <w14:ligatures w14:val="none"/>
         </w:rPr>
-        <w:t>├─</w:t>
-      </w:r>
-      <w:proofErr w:type="gramStart"/>
-      <w:r>
-        <w:rPr>
-          <w:rFonts w:ascii="Consolas" w:eastAsia="Times New Roman" w:hAnsi="Consolas" w:cs="Courier New"/>
-          <w:color w:val="0F1115"/>
-          <w:kern w:val="0"/>
-          <w:sz w:val="20"/>
-          <w:szCs w:val="20"/>
-          <w:lang w:eastAsia="en-GH"/>
-          <w14:ligatures w14:val="none"/>
-        </w:rPr>
-        <w:t>─ .env</w:t>
-      </w:r>
-      <w:proofErr w:type="gramEnd"/>
-      <w:r>
-        <w:rPr>
-          <w:rFonts w:ascii="Consolas" w:eastAsia="Times New Roman" w:hAnsi="Consolas" w:cs="Courier New"/>
-          <w:color w:val="0F1115"/>
-          <w:kern w:val="0"/>
-          <w:sz w:val="20"/>
-          <w:szCs w:val="20"/>
-          <w:lang w:eastAsia="en-GH"/>
-          <w14:ligatures w14:val="none"/>
-        </w:rPr>
-        <w:t xml:space="preserve">                 # API keys (keep secret)</w:t>
+        <w:t>├── .env                 # API keys (keep secret)</w:t>
       </w:r>
     </w:p>
     <w:p>

</xml_diff>